<commit_message>
Add chat history sheet, sidebar profile, and grounding behaviour docs.
Past conversations slide-over with full-screen dim; Rajiv Sehgal initials in sidebar; stakeholder doc rev with source-integrity contract.

Co-authored-by: Cursor <cursoragent@cursor.com>
</commit_message>
<xml_diff>
--- a/docs/ADGM-Agent-Behaviours-and-Answer-Formats.docx
+++ b/docs/ADGM-Agent-Behaviours-and-Answer-Formats.docx
@@ -28,7 +28,7 @@
     </w:p>
     <w:p>
       <w:r>
-        <w:t>**Version:** June 2026 (aligned to current prototype specification)</w:t>
+        <w:t>**Version:** June 2026 — rev. adds **§6 Grounding &amp; Source Integrity** and aligns answer formats to it.</w:t>
       </w:r>
     </w:p>
     <w:p/>
@@ -48,6 +48,11 @@
     <w:p>
       <w:r>
         <w:t>Answers are grounded in demo institutional data: calendar, action register, knowledge base, market snapshot, and department metrics. When the Claude API is enabled, responses are generated live; otherwise the same structures are delivered from curated demo scripts.</w:t>
+      </w:r>
+    </w:p>
+    <w:p>
+      <w:r>
+        <w:t>**Every factual claim is tied to a cited source and validated against the data actually supplied to the model.** The platform is built to *abstain* — to say "no source available" — rather than invent. How that is enforced, not merely asserted, is set out in §6.</w:t>
       </w:r>
     </w:p>
     <w:p/>
@@ -160,7 +165,7 @@
           </w:tcPr>
           <w:p>
             <w:r>
-              <w:t>UI highlights participating agents (e.g. Policy + Strategy) while the answer streams.</w:t>
+              <w:t>UI highlights participating agents (e.g. Policy + Strategy) while the answer streams. A chip is shown only when that specialist's instruction block was actually placed in the prompt — see §6.4.</w:t>
             </w:r>
           </w:p>
         </w:tc>
@@ -182,7 +187,7 @@
           </w:tcPr>
           <w:p>
             <w:r>
-              <w:t>Default: system picks agents from the question topic (focus area). Can be turned off in Settings for manual selection.</w:t>
+              <w:t>Default: system picks agents from the question topic (focus area), which in turn selects the specialist blocks **and the data slices** loaded into the call. Can be turned off in Settings for manual selection.</w:t>
             </w:r>
           </w:p>
         </w:tc>
@@ -216,7 +221,7 @@
           </w:tcPr>
           <w:p>
             <w:r>
-              <w:t>**Confidence &amp; sources**</w:t>
+              <w:t>**Grounding &amp; sources**</w:t>
             </w:r>
           </w:p>
         </w:tc>
@@ -226,7 +231,7 @@
           </w:tcPr>
           <w:p>
             <w:r>
-              <w:t>Answers may show a confidence score and linked knowledge-base documents when available.</w:t>
+              <w:t>Answers show a **grounding indicator** (full / partial / inferred) and resolve cited source handles to knowledge-base documents. This replaces the earlier model-reported confidence score — see §6.</w:t>
             </w:r>
           </w:p>
         </w:tc>
@@ -269,22 +274,22 @@
     </w:p>
     <w:p>
       <w:r>
-        <w:t>2. System routes to one or more agents.</w:t>
+        <w:t>2. System routes to one or more agents **and assembles the matching context** (calendar, CRM/actions, KB, market slices).</w:t>
       </w:r>
     </w:p>
     <w:p>
       <w:r>
-        <w:t>3. Agents draw on calendar, CRM/actions, KB, and market feeds (demo data in prototype).</w:t>
+        <w:t>3. Agents draw on that injected context (demo data in prototype), each record carrying a source handle.</w:t>
       </w:r>
     </w:p>
     <w:p>
       <w:r>
-        <w:t>4. Orchestrator synthesises one executive-grade markdown response.</w:t>
+        <w:t>4. Orchestrator synthesises one executive-grade markdown response, citing handles for every factual claim.</w:t>
       </w:r>
     </w:p>
     <w:p>
       <w:r>
-        <w:t>5. UI shows agents used, confidence, and sources.</w:t>
+        <w:t>5. UI shows agents used, the grounding indicator, and source links; high-stakes answers pass a verification step first (§6.5).</w:t>
       </w:r>
     </w:p>
     <w:p/>
@@ -752,7 +757,7 @@
         <w:pStyle w:val="ListBullet"/>
       </w:pPr>
       <w:r>
-        <w:t>Scores opportunities against **D33** and Abu Dhabi economic priorities.</w:t>
+        <w:t>Scores opportunities against **D33** and Abu Dhabi economic priorities, citing the scorecard datapoint behind each score.</w:t>
       </w:r>
     </w:p>
     <w:p>
@@ -760,7 +765,7 @@
         <w:pStyle w:val="ListBullet"/>
       </w:pPr>
       <w:r>
-        <w:t>Produces competitor benchmark tables (multi-dimension scoring).</w:t>
+        <w:t>Produces competitor benchmark tables (multi-dimension scoring) sourced to a named benchmark document.</w:t>
       </w:r>
     </w:p>
     <w:p>
@@ -768,7 +773,7 @@
         <w:pStyle w:val="ListBullet"/>
       </w:pPr>
       <w:r>
-        <w:t>Connects market signals to CSO implications and timing (“why now”).</w:t>
+        <w:t>Connects market signals to CSO implications and timing (“why now”), with the read marked as analysis (§6.3).</w:t>
       </w:r>
     </w:p>
     <w:p>
@@ -1006,7 +1011,7 @@
         <w:pStyle w:val="ListBullet"/>
       </w:pPr>
       <w:r>
-        <w:t>Compares ADGM/FSRA position vs international benchmarks (e.g. MAS digital assets).</w:t>
+        <w:t>Compares ADGM/FSRA position vs international benchmarks (e.g. MAS digital assets), citing the source for each jurisdiction claim.</w:t>
       </w:r>
     </w:p>
     <w:p>
@@ -1244,7 +1249,7 @@
         <w:pStyle w:val="ListBullet"/>
       </w:pPr>
       <w:r>
-        <w:t>Living stakeholder profiles: relationship warmth, last touchpoints, sensitivities.</w:t>
+        <w:t>Living stakeholder profiles: relationship warmth, last touchpoints, sensitivities — each drawn from a CRM record.</w:t>
       </w:r>
     </w:p>
     <w:p>
@@ -1268,7 +1273,7 @@
         <w:pStyle w:val="ListBullet"/>
       </w:pPr>
       <w:r>
-        <w:t>Pre-meeting “who” and “their likely agenda” alongside CoS.</w:t>
+        <w:t>Pre-meeting “who” and “their likely agenda” alongside CoS; a likely-agenda inference with no source is marked as inferred.</w:t>
       </w:r>
     </w:p>
     <w:p>
@@ -1514,7 +1519,7 @@
         <w:pStyle w:val="ListBullet"/>
       </w:pPr>
       <w:r>
-        <w:t>Applies CSO voice learning from approved prior notes.</w:t>
+        <w:t>Applies CSO voice learning from approved prior notes. Any metric quoted in a draft carries a source handle; ministerial output always runs the verification pass (§6.5).</w:t>
       </w:r>
     </w:p>
     <w:p>
@@ -1548,6 +1553,11 @@
       </w:pPr>
       <w:r>
         <w:t>4. When each agent is selected (routing)</w:t>
+      </w:r>
+    </w:p>
+    <w:p>
+      <w:r>
+        <w:t>Routing in a single-call architecture does not gate separate models. It selects **which specialist instruction blocks** and **which data slices** are assembled into the one call. Treat it as context assembly, not agent dispatch.</w:t>
       </w:r>
     </w:p>
     <w:p>
@@ -2129,7 +2139,7 @@
           </w:tcPr>
           <w:p>
             <w:r>
-              <w:t>Cites calendar, actions, KB document names; states when inferring</w:t>
+              <w:t>Every factual claim cites a **source handle** (`KB-`, `CAL-`, `ACT-`, `CRM-`, `MKT-`) that is validated against the data injected into the call. The model's own interpretation is marked as **analysis**, never stated as fact. Full contract in §6.</w:t>
             </w:r>
           </w:p>
         </w:tc>
@@ -2173,7 +2183,7 @@
           </w:tcPr>
           <w:p>
             <w:r>
-              <w:t>Agent chips, confidence %, source document links</w:t>
+              <w:t>Agent chips (a chip means the specialist block was in the prompt), a **grounding indicator** (full / partial / inferred) derived from source coverage, and source links that resolve to cited handles. No model-generated confidence percentage is shown.</w:t>
             </w:r>
           </w:p>
         </w:tc>
@@ -2181,12 +2191,12 @@
     </w:tbl>
     <w:p>
       <w:r>
-        <w:t>**Live AI (Claude):** One synthesised answer coordinating all active specialist perspectives (see system rules in platform).</w:t>
+        <w:t>**Live AI (Claude):** One synthesised answer coordinating all active specialist perspectives, subject to the grounding contract in §6.</w:t>
       </w:r>
     </w:p>
     <w:p>
       <w:r>
-        <w:t>**Demo mode:** Same topics use scripted templates matching the structures below.</w:t>
+        <w:t>**Demo mode:** Same topics use scripted templates matching the structures below; demo records carry the same handles so citations resolve.</w:t>
       </w:r>
     </w:p>
     <w:p/>
@@ -2200,7 +2210,7 @@
     </w:p>
     <w:p>
       <w:r>
-        <w:t>Use these as the **expected sections** inside a unified answer (headings may vary slightly in live AI).</w:t>
+        <w:t>Use these as the **expected sections** inside a unified answer. In a single-call system these are **enforced structural requirements**, not suggestions — they are the forcing function that stops one call from producing generic, unsourced prose. If a specialist is active, its required artefact (e.g. the Policy benchmark table, the Strategy scores) must be present and sourced.</w:t>
       </w:r>
     </w:p>
     <w:p>
@@ -2216,7 +2226,7 @@
         <w:pStyle w:val="ListBullet"/>
       </w:pPr>
       <w:r>
-        <w:t>Meeting: **when, where, prep status**</w:t>
+        <w:t>Meeting: **when, where, prep status** `[CAL-…]`</w:t>
       </w:r>
     </w:p>
     <w:p>
@@ -2232,7 +2242,7 @@
         <w:pStyle w:val="ListBullet"/>
       </w:pPr>
       <w:r>
-        <w:t>**Open / overdue actions** (owner, due date, status)</w:t>
+        <w:t>**Open / overdue actions** (owner, due date, status) `[ACT-…]`</w:t>
       </w:r>
     </w:p>
     <w:p>
@@ -2240,7 +2250,7 @@
         <w:pStyle w:val="ListBullet"/>
       </w:pPr>
       <w:r>
-        <w:t>**Recommended next steps** (numbered, 1–3 items)</w:t>
+        <w:t>**Recommended next steps** (numbered, 1–3 items) — marked as analysis</w:t>
       </w:r>
     </w:p>
     <w:p>
@@ -2256,7 +2266,7 @@
         <w:pStyle w:val="ListBullet"/>
       </w:pPr>
       <w:r>
-        <w:t>**Market &amp; competitor context** (GCC, sectors, named centres)</w:t>
+        <w:t>**Market &amp; competitor context** (GCC, sectors, named centres) `[MKT-…]`</w:t>
       </w:r>
     </w:p>
     <w:p>
@@ -2264,7 +2274,7 @@
         <w:pStyle w:val="ListBullet"/>
       </w:pPr>
       <w:r>
-        <w:t>**D33 alignment** or opportunity scores</w:t>
+        <w:t>**D33 alignment** or opportunity scores, each citing the scorecard datapoint</w:t>
       </w:r>
     </w:p>
     <w:p>
@@ -2272,7 +2282,7 @@
         <w:pStyle w:val="ListBullet"/>
       </w:pPr>
       <w:r>
-        <w:t>**Strategic read** — one clear implication for the CSO</w:t>
+        <w:t>**Strategic read** — one clear implication for the CSO, marked as analysis</w:t>
       </w:r>
     </w:p>
     <w:p>
@@ -2280,7 +2290,7 @@
         <w:pStyle w:val="ListBullet"/>
       </w:pPr>
       <w:r>
-        <w:t>Tables: competitor comparison or ranked opportunities</w:t>
+        <w:t>Tables: competitor comparison or ranked opportunities, sourced to a benchmark document</w:t>
       </w:r>
     </w:p>
     <w:p>
@@ -2296,7 +2306,7 @@
         <w:pStyle w:val="ListBullet"/>
       </w:pPr>
       <w:r>
-        <w:t>**ADGM / FSRA position** in plain language</w:t>
+        <w:t>**ADGM / FSRA position** in plain language `[KB-…]`</w:t>
       </w:r>
     </w:p>
     <w:p>
@@ -2312,7 +2322,7 @@
         <w:pStyle w:val="ListBullet"/>
       </w:pPr>
       <w:r>
-        <w:t>**Benchmark table:** dimension × ADGM × comparator (e.g. MAS)</w:t>
+        <w:t>**Benchmark table:** dimension × ADGM × comparator (e.g. MAS), sourced to a named benchmark doc with an "as of" date</w:t>
       </w:r>
     </w:p>
     <w:p>
@@ -2320,7 +2330,7 @@
         <w:pStyle w:val="ListBullet"/>
       </w:pPr>
       <w:r>
-        <w:t>**Recommended regulatory action** with date if in action register</w:t>
+        <w:t>**Recommended regulatory action** with date if in action register `[ACT-…]` — marked as analysis</w:t>
       </w:r>
     </w:p>
     <w:p>
@@ -2336,7 +2346,7 @@
         <w:pStyle w:val="ListBullet"/>
       </w:pPr>
       <w:r>
-        <w:t>**Relationship status** (warm / neutral / new) and last engagement</w:t>
+        <w:t>**Relationship status** (warm / neutral / new) and last engagement `[CRM-…]`</w:t>
       </w:r>
     </w:p>
     <w:p>
@@ -2344,7 +2354,7 @@
         <w:pStyle w:val="ListBullet"/>
       </w:pPr>
       <w:r>
-        <w:t>**Their likely agenda** or interests</w:t>
+        <w:t>**Their likely agenda** or interests — marked **inferred** where no source supports it</w:t>
       </w:r>
     </w:p>
     <w:p>
@@ -2352,7 +2362,7 @@
         <w:pStyle w:val="ListBullet"/>
       </w:pPr>
       <w:r>
-        <w:t>**Open commitments** (table or bullets)</w:t>
+        <w:t>**Open commitments** (table or bullets) `[ACT-…]`</w:t>
       </w:r>
     </w:p>
     <w:p>
@@ -2360,7 +2370,7 @@
         <w:pStyle w:val="ListBullet"/>
       </w:pPr>
       <w:r>
-        <w:t>**Suggested next step** for the engagement</w:t>
+        <w:t>**Suggested next step** for the engagement — marked as analysis</w:t>
       </w:r>
     </w:p>
     <w:p>
@@ -2392,7 +2402,7 @@
         <w:pStyle w:val="ListBullet"/>
       </w:pPr>
       <w:r>
-        <w:t>Tone note: ministerial / keynote / FSRA terminology review</w:t>
+        <w:t>Any **metric quoted** carries a source handle; tone note: ministerial / keynote / FSRA terminology review</w:t>
       </w:r>
     </w:p>
     <w:p/>
@@ -2401,12 +2411,816 @@
         <w:pStyle w:val="Heading1"/>
       </w:pPr>
       <w:r>
-        <w:t>6. Six briefing document formats</w:t>
+        <w:t>6. Grounding &amp; source integrity</w:t>
+      </w:r>
+    </w:p>
+    <w:p>
+      <w:r>
+        <w:t>This section is the contract that makes "truthful sources" mechanical rather than aspirational. A specification cannot stop a model from inventing a plausible-looking source; only enforcement can. Each rule below pairs a **model behaviour** (instructed in the system prompt) with a **system check** (run after generation). Read the enforcement column as the reason to trust the rule.</w:t>
+      </w:r>
+    </w:p>
+    <w:p>
+      <w:pPr>
+        <w:pStyle w:val="Heading2"/>
+      </w:pPr>
+      <w:r>
+        <w:t>6.1 Source handles</w:t>
+      </w:r>
+    </w:p>
+    <w:p>
+      <w:r>
+        <w:t>Every record injected into a call carries a stable handle, its origin system, and a last-updated timestamp. The model may cite **only** handles that appear in the context it was given.</w:t>
+      </w:r>
+    </w:p>
+    <w:tbl>
+      <w:tblPr>
+        <w:tblStyle w:val="TableGrid"/>
+        <w:tblW w:type="auto" w:w="0"/>
+        <w:tblLook w:firstColumn="1" w:firstRow="1" w:lastColumn="0" w:lastRow="0" w:noHBand="0" w:noVBand="1" w:val="04A0"/>
+      </w:tblPr>
+      <w:tblGrid>
+        <w:gridCol w:w="3120"/>
+        <w:gridCol w:w="3120"/>
+        <w:gridCol w:w="3120"/>
+      </w:tblGrid>
+      <w:tr>
+        <w:tc>
+          <w:tcPr>
+            <w:tcW w:type="dxa" w:w="3120"/>
+          </w:tcPr>
+          <w:p>
+            <w:r>
+              <w:rPr>
+                <w:b/>
+                <w:sz w:val="20"/>
+              </w:rPr>
+              <w:t>Prefix</w:t>
+            </w:r>
+          </w:p>
+        </w:tc>
+        <w:tc>
+          <w:tcPr>
+            <w:tcW w:type="dxa" w:w="3120"/>
+          </w:tcPr>
+          <w:p>
+            <w:r>
+              <w:rPr>
+                <w:b/>
+                <w:sz w:val="20"/>
+              </w:rPr>
+              <w:t>Source</w:t>
+            </w:r>
+          </w:p>
+        </w:tc>
+        <w:tc>
+          <w:tcPr>
+            <w:tcW w:type="dxa" w:w="3120"/>
+          </w:tcPr>
+          <w:p>
+            <w:r>
+              <w:rPr>
+                <w:b/>
+                <w:sz w:val="20"/>
+              </w:rPr>
+              <w:t>Example</w:t>
+            </w:r>
+          </w:p>
+        </w:tc>
+      </w:tr>
+      <w:tr>
+        <w:tc>
+          <w:tcPr>
+            <w:tcW w:type="dxa" w:w="3120"/>
+          </w:tcPr>
+          <w:p>
+            <w:r>
+              <w:t>--------</w:t>
+            </w:r>
+          </w:p>
+        </w:tc>
+        <w:tc>
+          <w:tcPr>
+            <w:tcW w:type="dxa" w:w="3120"/>
+          </w:tcPr>
+          <w:p>
+            <w:r>
+              <w:t>--------</w:t>
+            </w:r>
+          </w:p>
+        </w:tc>
+        <w:tc>
+          <w:tcPr>
+            <w:tcW w:type="dxa" w:w="3120"/>
+          </w:tcPr>
+          <w:p>
+            <w:r>
+              <w:t>---------</w:t>
+            </w:r>
+          </w:p>
+        </w:tc>
+      </w:tr>
+      <w:tr>
+        <w:tc>
+          <w:tcPr>
+            <w:tcW w:type="dxa" w:w="3120"/>
+          </w:tcPr>
+          <w:p>
+            <w:r>
+              <w:t>`KB-`</w:t>
+            </w:r>
+          </w:p>
+        </w:tc>
+        <w:tc>
+          <w:tcPr>
+            <w:tcW w:type="dxa" w:w="3120"/>
+          </w:tcPr>
+          <w:p>
+            <w:r>
+              <w:t>Knowledge base document</w:t>
+            </w:r>
+          </w:p>
+        </w:tc>
+        <w:tc>
+          <w:tcPr>
+            <w:tcW w:type="dxa" w:w="3120"/>
+          </w:tcPr>
+          <w:p>
+            <w:r>
+              <w:t>`[KB-014]`</w:t>
+            </w:r>
+          </w:p>
+        </w:tc>
+      </w:tr>
+      <w:tr>
+        <w:tc>
+          <w:tcPr>
+            <w:tcW w:type="dxa" w:w="3120"/>
+          </w:tcPr>
+          <w:p>
+            <w:r>
+              <w:t>`ACT-`</w:t>
+            </w:r>
+          </w:p>
+        </w:tc>
+        <w:tc>
+          <w:tcPr>
+            <w:tcW w:type="dxa" w:w="3120"/>
+          </w:tcPr>
+          <w:p>
+            <w:r>
+              <w:t>Action register item</w:t>
+            </w:r>
+          </w:p>
+        </w:tc>
+        <w:tc>
+          <w:tcPr>
+            <w:tcW w:type="dxa" w:w="3120"/>
+          </w:tcPr>
+          <w:p>
+            <w:r>
+              <w:t>`[ACT-07]`</w:t>
+            </w:r>
+          </w:p>
+        </w:tc>
+      </w:tr>
+      <w:tr>
+        <w:tc>
+          <w:tcPr>
+            <w:tcW w:type="dxa" w:w="3120"/>
+          </w:tcPr>
+          <w:p>
+            <w:r>
+              <w:t>`CAL-`</w:t>
+            </w:r>
+          </w:p>
+        </w:tc>
+        <w:tc>
+          <w:tcPr>
+            <w:tcW w:type="dxa" w:w="3120"/>
+          </w:tcPr>
+          <w:p>
+            <w:r>
+              <w:t>Calendar event</w:t>
+            </w:r>
+          </w:p>
+        </w:tc>
+        <w:tc>
+          <w:tcPr>
+            <w:tcW w:type="dxa" w:w="3120"/>
+          </w:tcPr>
+          <w:p>
+            <w:r>
+              <w:t>`[CAL-1500]`</w:t>
+            </w:r>
+          </w:p>
+        </w:tc>
+      </w:tr>
+      <w:tr>
+        <w:tc>
+          <w:tcPr>
+            <w:tcW w:type="dxa" w:w="3120"/>
+          </w:tcPr>
+          <w:p>
+            <w:r>
+              <w:t>`CRM-`</w:t>
+            </w:r>
+          </w:p>
+        </w:tc>
+        <w:tc>
+          <w:tcPr>
+            <w:tcW w:type="dxa" w:w="3120"/>
+          </w:tcPr>
+          <w:p>
+            <w:r>
+              <w:t>Stakeholder record</w:t>
+            </w:r>
+          </w:p>
+        </w:tc>
+        <w:tc>
+          <w:tcPr>
+            <w:tcW w:type="dxa" w:w="3120"/>
+          </w:tcPr>
+          <w:p>
+            <w:r>
+              <w:t>`[CRM-emaar]`</w:t>
+            </w:r>
+          </w:p>
+        </w:tc>
+      </w:tr>
+      <w:tr>
+        <w:tc>
+          <w:tcPr>
+            <w:tcW w:type="dxa" w:w="3120"/>
+          </w:tcPr>
+          <w:p>
+            <w:r>
+              <w:t>`MKT-`</w:t>
+            </w:r>
+          </w:p>
+        </w:tc>
+        <w:tc>
+          <w:tcPr>
+            <w:tcW w:type="dxa" w:w="3120"/>
+          </w:tcPr>
+          <w:p>
+            <w:r>
+              <w:t>Market snapshot datapoint</w:t>
+            </w:r>
+          </w:p>
+        </w:tc>
+        <w:tc>
+          <w:tcPr>
+            <w:tcW w:type="dxa" w:w="3120"/>
+          </w:tcPr>
+          <w:p>
+            <w:r>
+              <w:t>`[MKT-2026-06-03]`</w:t>
+            </w:r>
+          </w:p>
+        </w:tc>
+      </w:tr>
+    </w:tbl>
+    <w:p>
+      <w:pPr>
+        <w:pStyle w:val="Heading2"/>
+      </w:pPr>
+      <w:r>
+        <w:t>6.2 The grounding contract</w:t>
+      </w:r>
+    </w:p>
+    <w:tbl>
+      <w:tblPr>
+        <w:tblStyle w:val="TableGrid"/>
+        <w:tblW w:type="auto" w:w="0"/>
+        <w:tblLook w:firstColumn="1" w:firstRow="1" w:lastColumn="0" w:lastRow="0" w:noHBand="0" w:noVBand="1" w:val="04A0"/>
+      </w:tblPr>
+      <w:tblGrid>
+        <w:gridCol w:w="2340"/>
+        <w:gridCol w:w="2340"/>
+        <w:gridCol w:w="2340"/>
+        <w:gridCol w:w="2340"/>
+      </w:tblGrid>
+      <w:tr>
+        <w:tc>
+          <w:tcPr>
+            <w:tcW w:type="dxa" w:w="2340"/>
+          </w:tcPr>
+          <w:p>
+            <w:r>
+              <w:rPr>
+                <w:b/>
+                <w:sz w:val="20"/>
+              </w:rPr>
+              <w:t>#</w:t>
+            </w:r>
+          </w:p>
+        </w:tc>
+        <w:tc>
+          <w:tcPr>
+            <w:tcW w:type="dxa" w:w="2340"/>
+          </w:tcPr>
+          <w:p>
+            <w:r>
+              <w:rPr>
+                <w:b/>
+                <w:sz w:val="20"/>
+              </w:rPr>
+              <w:t>Rule</w:t>
+            </w:r>
+          </w:p>
+        </w:tc>
+        <w:tc>
+          <w:tcPr>
+            <w:tcW w:type="dxa" w:w="2340"/>
+          </w:tcPr>
+          <w:p>
+            <w:r>
+              <w:rPr>
+                <w:b/>
+                <w:sz w:val="20"/>
+              </w:rPr>
+              <w:t>Model behaviour</w:t>
+            </w:r>
+          </w:p>
+        </w:tc>
+        <w:tc>
+          <w:tcPr>
+            <w:tcW w:type="dxa" w:w="2340"/>
+          </w:tcPr>
+          <w:p>
+            <w:r>
+              <w:rPr>
+                <w:b/>
+                <w:sz w:val="20"/>
+              </w:rPr>
+              <w:t>System enforcement</w:t>
+            </w:r>
+          </w:p>
+        </w:tc>
+      </w:tr>
+      <w:tr>
+        <w:tc>
+          <w:tcPr>
+            <w:tcW w:type="dxa" w:w="2340"/>
+          </w:tcPr>
+          <w:p>
+            <w:r>
+              <w:t>---</w:t>
+            </w:r>
+          </w:p>
+        </w:tc>
+        <w:tc>
+          <w:tcPr>
+            <w:tcW w:type="dxa" w:w="2340"/>
+          </w:tcPr>
+          <w:p>
+            <w:r>
+              <w:t>------</w:t>
+            </w:r>
+          </w:p>
+        </w:tc>
+        <w:tc>
+          <w:tcPr>
+            <w:tcW w:type="dxa" w:w="2340"/>
+          </w:tcPr>
+          <w:p>
+            <w:r>
+              <w:t>-----------------</w:t>
+            </w:r>
+          </w:p>
+        </w:tc>
+        <w:tc>
+          <w:tcPr>
+            <w:tcW w:type="dxa" w:w="2340"/>
+          </w:tcPr>
+          <w:p>
+            <w:r>
+              <w:t>--------------------</w:t>
+            </w:r>
+          </w:p>
+        </w:tc>
+      </w:tr>
+      <w:tr>
+        <w:tc>
+          <w:tcPr>
+            <w:tcW w:type="dxa" w:w="2340"/>
+          </w:tcPr>
+          <w:p>
+            <w:r>
+              <w:t>1</w:t>
+            </w:r>
+          </w:p>
+        </w:tc>
+        <w:tc>
+          <w:tcPr>
+            <w:tcW w:type="dxa" w:w="2340"/>
+          </w:tcPr>
+          <w:p>
+            <w:r>
+              <w:t>**Cite by handle**</w:t>
+            </w:r>
+          </w:p>
+        </w:tc>
+        <w:tc>
+          <w:tcPr>
+            <w:tcW w:type="dxa" w:w="2340"/>
+          </w:tcPr>
+          <w:p>
+            <w:r>
+              <w:t>Every factual claim about institutional data carries a source handle.</w:t>
+            </w:r>
+          </w:p>
+        </w:tc>
+        <w:tc>
+          <w:tcPr>
+            <w:tcW w:type="dxa" w:w="2340"/>
+          </w:tcPr>
+          <w:p>
+            <w:r>
+              <w:t>After generation, each cited handle is checked against the set actually injected; unknown handles are stripped and the claim flagged.</w:t>
+            </w:r>
+          </w:p>
+        </w:tc>
+      </w:tr>
+      <w:tr>
+        <w:tc>
+          <w:tcPr>
+            <w:tcW w:type="dxa" w:w="2340"/>
+          </w:tcPr>
+          <w:p>
+            <w:r>
+              <w:t>2</w:t>
+            </w:r>
+          </w:p>
+        </w:tc>
+        <w:tc>
+          <w:tcPr>
+            <w:tcW w:type="dxa" w:w="2340"/>
+          </w:tcPr>
+          <w:p>
+            <w:r>
+              <w:t>**Snippet-anchor strong claims**</w:t>
+            </w:r>
+          </w:p>
+        </w:tc>
+        <w:tc>
+          <w:tcPr>
+            <w:tcW w:type="dxa" w:w="2340"/>
+          </w:tcPr>
+          <w:p>
+            <w:r>
+              <w:t>For a number, date, or regulatory position, attach a short supporting snippet beside the handle.</w:t>
+            </w:r>
+          </w:p>
+        </w:tc>
+        <w:tc>
+          <w:tcPr>
+            <w:tcW w:type="dxa" w:w="2340"/>
+          </w:tcPr>
+          <w:p>
+            <w:r>
+              <w:t>The snippet is substring-matched against the source text; no match → claim marked **unverified**.</w:t>
+            </w:r>
+          </w:p>
+        </w:tc>
+      </w:tr>
+      <w:tr>
+        <w:tc>
+          <w:tcPr>
+            <w:tcW w:type="dxa" w:w="2340"/>
+          </w:tcPr>
+          <w:p>
+            <w:r>
+              <w:t>3</w:t>
+            </w:r>
+          </w:p>
+        </w:tc>
+        <w:tc>
+          <w:tcPr>
+            <w:tcW w:type="dxa" w:w="2340"/>
+          </w:tcPr>
+          <w:p>
+            <w:r>
+              <w:t>**Closed-book for facts**</w:t>
+            </w:r>
+          </w:p>
+        </w:tc>
+        <w:tc>
+          <w:tcPr>
+            <w:tcW w:type="dxa" w:w="2340"/>
+          </w:tcPr>
+          <w:p>
+            <w:r>
+              <w:t>Factual statements derive only from injected context.</w:t>
+            </w:r>
+          </w:p>
+        </w:tc>
+        <w:tc>
+          <w:tcPr>
+            <w:tcW w:type="dxa" w:w="2340"/>
+          </w:tcPr>
+          <w:p>
+            <w:r>
+              <w:t>The verification pass (§6.5) flags any factual sentence carrying no valid handle.</w:t>
+            </w:r>
+          </w:p>
+        </w:tc>
+      </w:tr>
+      <w:tr>
+        <w:tc>
+          <w:tcPr>
+            <w:tcW w:type="dxa" w:w="2340"/>
+          </w:tcPr>
+          <w:p>
+            <w:r>
+              <w:t>4</w:t>
+            </w:r>
+          </w:p>
+        </w:tc>
+        <w:tc>
+          <w:tcPr>
+            <w:tcW w:type="dxa" w:w="2340"/>
+          </w:tcPr>
+          <w:p>
+            <w:r>
+              <w:t>**Open-book for judgement**</w:t>
+            </w:r>
+          </w:p>
+        </w:tc>
+        <w:tc>
+          <w:tcPr>
+            <w:tcW w:type="dxa" w:w="2340"/>
+          </w:tcPr>
+          <w:p>
+            <w:r>
+              <w:t>The model's interpretation is permitted but labelled **analysis** — never stated as fact.</w:t>
+            </w:r>
+          </w:p>
+        </w:tc>
+        <w:tc>
+          <w:tcPr>
+            <w:tcW w:type="dxa" w:w="2340"/>
+          </w:tcPr>
+          <w:p>
+            <w:r>
+              <w:t>The answer format separates cited facts from the marked read (§6.3); unlabelled assertions are flagged.</w:t>
+            </w:r>
+          </w:p>
+        </w:tc>
+      </w:tr>
+      <w:tr>
+        <w:tc>
+          <w:tcPr>
+            <w:tcW w:type="dxa" w:w="2340"/>
+          </w:tcPr>
+          <w:p>
+            <w:r>
+              <w:t>5</w:t>
+            </w:r>
+          </w:p>
+        </w:tc>
+        <w:tc>
+          <w:tcPr>
+            <w:tcW w:type="dxa" w:w="2340"/>
+          </w:tcPr>
+          <w:p>
+            <w:r>
+              <w:t>**Licence to abstain**</w:t>
+            </w:r>
+          </w:p>
+        </w:tc>
+        <w:tc>
+          <w:tcPr>
+            <w:tcW w:type="dxa" w:w="2340"/>
+          </w:tcPr>
+          <w:p>
+            <w:r>
+              <w:t>"Not in the knowledge base / no source available" is a valid, encouraged answer.</w:t>
+            </w:r>
+          </w:p>
+        </w:tc>
+        <w:tc>
+          <w:tcPr>
+            <w:tcW w:type="dxa" w:w="2340"/>
+          </w:tcPr>
+          <w:p>
+            <w:r>
+              <w:t>Abstention is scored as a **correct** outcome in eval, not a failure; the prompt rewards it over a complete-looking guess.</w:t>
+            </w:r>
+          </w:p>
+        </w:tc>
+      </w:tr>
+      <w:tr>
+        <w:tc>
+          <w:tcPr>
+            <w:tcW w:type="dxa" w:w="2340"/>
+          </w:tcPr>
+          <w:p>
+            <w:r>
+              <w:t>6</w:t>
+            </w:r>
+          </w:p>
+        </w:tc>
+        <w:tc>
+          <w:tcPr>
+            <w:tcW w:type="dxa" w:w="2340"/>
+          </w:tcPr>
+          <w:p>
+            <w:r>
+              <w:t>**No fabricated specifics**</w:t>
+            </w:r>
+          </w:p>
+        </w:tc>
+        <w:tc>
+          <w:tcPr>
+            <w:tcW w:type="dxa" w:w="2340"/>
+          </w:tcPr>
+          <w:p>
+            <w:r>
+              <w:t>Numbers, names, dates, and clauses must trace to a source or be expressed qualitatively.</w:t>
+            </w:r>
+          </w:p>
+        </w:tc>
+        <w:tc>
+          <w:tcPr>
+            <w:tcW w:type="dxa" w:w="2340"/>
+          </w:tcPr>
+          <w:p>
+            <w:r>
+              <w:t>Any specific value with no handle is caught by the no-numeric-without-handle check and by §6.5.</w:t>
+            </w:r>
+          </w:p>
+        </w:tc>
+      </w:tr>
+      <w:tr>
+        <w:tc>
+          <w:tcPr>
+            <w:tcW w:type="dxa" w:w="2340"/>
+          </w:tcPr>
+          <w:p>
+            <w:r>
+              <w:t>7</w:t>
+            </w:r>
+          </w:p>
+        </w:tc>
+        <w:tc>
+          <w:tcPr>
+            <w:tcW w:type="dxa" w:w="2340"/>
+          </w:tcPr>
+          <w:p>
+            <w:r>
+              <w:t>**Freshness**</w:t>
+            </w:r>
+          </w:p>
+        </w:tc>
+        <w:tc>
+          <w:tcPr>
+            <w:tcW w:type="dxa" w:w="2340"/>
+          </w:tcPr>
+          <w:p>
+            <w:r>
+              <w:t>Market and time-sensitive claims state "as of [date]" taken from the record timestamp.</w:t>
+            </w:r>
+          </w:p>
+        </w:tc>
+        <w:tc>
+          <w:tcPr>
+            <w:tcW w:type="dxa" w:w="2340"/>
+          </w:tcPr>
+          <w:p>
+            <w:r>
+              <w:t>Records older than a configurable window are surfaced as **stale** rather than presented as current.</w:t>
+            </w:r>
+          </w:p>
+        </w:tc>
+      </w:tr>
+    </w:tbl>
+    <w:p>
+      <w:pPr>
+        <w:pStyle w:val="Heading2"/>
+      </w:pPr>
+      <w:r>
+        <w:t>6.3 Verified vs inferred (answer presentation)</w:t>
+      </w:r>
+    </w:p>
+    <w:p>
+      <w:r>
+        <w:t>The structure of the answer carries the honesty so the executive can see it at a glance:</w:t>
+      </w:r>
+    </w:p>
+    <w:p>
+      <w:pPr>
+        <w:pStyle w:val="ListBullet"/>
+      </w:pPr>
+      <w:r>
+        <w:t>**Facts** are cited inline or gathered in a `Sources:` line.</w:t>
+      </w:r>
+    </w:p>
+    <w:p>
+      <w:pPr>
+        <w:pStyle w:val="ListBullet"/>
+      </w:pPr>
+      <w:r>
+        <w:t>The **strategic read** sits under a clearly marked heading (e.g. "Analysis (Policy AI)").</w:t>
+      </w:r>
+    </w:p>
+    <w:p>
+      <w:pPr>
+        <w:pStyle w:val="ListBullet"/>
+      </w:pPr>
+      <w:r>
+        <w:t>No confidence percentage is shown. A **grounding indicator** — `full` / `partial` / `inferred` — replaces it, derived from coverage: the share of factual claims carrying a valid handle.</w:t>
+      </w:r>
+    </w:p>
+    <w:p>
+      <w:pPr>
+        <w:pStyle w:val="Heading2"/>
+      </w:pPr>
+      <w:r>
+        <w:t>6.4 Machine grounding block</w:t>
+      </w:r>
+    </w:p>
+    <w:p>
+      <w:r>
+        <w:t>Alongside the prose, the model emits a structured block — not shown to the executive — that the platform validates:</w:t>
+      </w:r>
+    </w:p>
+    <w:p>
+      <w:pPr>
+        <w:spacing w:before="120" w:after="160"/>
+        <w:ind w:left="504"/>
+      </w:pPr>
+      <w:r>
+        <w:rPr>
+          <w:rFonts w:ascii="Consolas" w:hAnsi="Consolas"/>
+          <w:color w:val="333333"/>
+          <w:sz w:val="18"/>
+        </w:rPr>
+        <w:t>agents_used: [policy, strategy]</w:t>
+        <w:br/>
+        <w:t>sources_cited: [KB-014, KB-022, ACT-07]</w:t>
+        <w:br/>
+        <w:t>grounding: partial            # full | partial | inferred</w:t>
+        <w:br/>
+        <w:t>unverified_claims:</w:t>
+        <w:br/>
+        <w:t xml:space="preserve">  - "MAS raised its stablecoin reserve ratio in Q1"   # no handle → flagged</w:t>
+      </w:r>
+    </w:p>
+    <w:p>
+      <w:pPr>
+        <w:pStyle w:val="ListBullet"/>
+      </w:pPr>
+      <w:r>
+        <w:t>`sources_cited` is validated against the injected handles; invented entries are stripped.</w:t>
+      </w:r>
+    </w:p>
+    <w:p>
+      <w:pPr>
+        <w:pStyle w:val="ListBullet"/>
+      </w:pPr>
+      <w:r>
+        <w:t>`agents_used` drives the chips, so **a chip means a specialist block was genuinely in the prompt**, not a label applied afterward.</w:t>
+      </w:r>
+    </w:p>
+    <w:p>
+      <w:pPr>
+        <w:pStyle w:val="ListBullet"/>
+      </w:pPr>
+      <w:r>
+        <w:t>`unverified_claims` surfaces anything the verification pass could not support.</w:t>
+      </w:r>
+    </w:p>
+    <w:p>
+      <w:pPr>
+        <w:pStyle w:val="Heading2"/>
+      </w:pPr>
+      <w:r>
+        <w:t>6.5 Verification pass (high-stakes)</w:t>
+      </w:r>
+    </w:p>
+    <w:p>
+      <w:r>
+        <w:t>For ministerial notes, anything bound for the HH office, or any answer marked `grounding: inferred` on a material decision, a second model pass takes the draft plus the injected sources and checks each factual claim for support. It returns a pass/flag list **before** the answer reaches the executive. In production this is paired with a human approval gate on ministerial output.</w:t>
+      </w:r>
+    </w:p>
+    <w:p/>
+    <w:p>
+      <w:pPr>
+        <w:pStyle w:val="Heading1"/>
+      </w:pPr>
+      <w:r>
+        <w:t>7. Six briefing document formats</w:t>
       </w:r>
     </w:p>
     <w:p>
       <w:r>
         <w:t>Briefings are **structured documents** (not casual chat). Target read time: **under 2 minutes**. No generic closing prompts.</w:t>
+      </w:r>
+    </w:p>
+    <w:p>
+      <w:r>
+        <w:t>Briefings follow the same grounding contract (§6): every injected datapoint carries a handle and is cited inline. Because briefings omit closing prompts, the `Sources:` line and the grounding indicator are the only metadata shown.</w:t>
       </w:r>
     </w:p>
     <w:tbl>
@@ -2776,10 +3590,7 @@
     </w:tbl>
     <w:p>
       <w:r>
-        <w:rPr>
-          <w:i/>
-        </w:rPr>
-        <w:t>**Data injected into every briefing**</w:t>
+        <w:t>**Data injected into every briefing** (each item carries a handle and timestamp)</w:t>
       </w:r>
     </w:p>
     <w:p>
@@ -2787,7 +3598,7 @@
         <w:pStyle w:val="ListBullet"/>
       </w:pPr>
       <w:r>
-        <w:t>Next or relevant **calendar meeting** (title, time UAE, attendees, location, prep status)</w:t>
+        <w:t>Next or relevant **calendar meeting** (title, time UAE, attendees, location, prep status) `[CAL-…]`</w:t>
       </w:r>
     </w:p>
     <w:p>
@@ -2795,7 +3606,7 @@
         <w:pStyle w:val="ListBullet"/>
       </w:pPr>
       <w:r>
-        <w:t>**Open action register**</w:t>
+        <w:t>**Open action register** `[ACT-…]`</w:t>
       </w:r>
     </w:p>
     <w:p>
@@ -2803,7 +3614,7 @@
         <w:pStyle w:val="ListBullet"/>
       </w:pPr>
       <w:r>
-        <w:t>**Market snapshot** (GCC, digital assets, competitor note, top sector)</w:t>
+        <w:t>**Market snapshot** (GCC, digital assets, competitor note, top sector) `[MKT-…]`</w:t>
       </w:r>
     </w:p>
     <w:p>
@@ -2811,7 +3622,7 @@
         <w:pStyle w:val="ListBullet"/>
       </w:pPr>
       <w:r>
-        <w:t>**Knowledge base** document list (cite names when used)</w:t>
+        <w:t>**Knowledge base** document list — cited by handle when used `[KB-…]`</w:t>
       </w:r>
     </w:p>
     <w:p/>
@@ -2820,7 +3631,12 @@
         <w:pStyle w:val="Heading1"/>
       </w:pPr>
       <w:r>
-        <w:t>7. Worked examples (demo-quality structures)</w:t>
+        <w:t>8. Worked examples (demo-quality structures)</w:t>
+      </w:r>
+    </w:p>
+    <w:p>
+      <w:r>
+        <w:t>These examples now model the grounding contract: facts carry handles, illustrative analysis is labelled, and a `Sources:` line with a grounding indicator closes each one.</w:t>
       </w:r>
     </w:p>
     <w:p>
@@ -2828,7 +3644,7 @@
         <w:pStyle w:val="Heading2"/>
       </w:pPr>
       <w:r>
-        <w:t>7.1 Policy + Strategy — Digital assets vs MAS</w:t>
+        <w:t>8.1 Policy + Strategy — Digital assets vs MAS</w:t>
       </w:r>
     </w:p>
     <w:p>
@@ -2847,26 +3663,36 @@
         <w:br/>
         <w:t>Where ADGM leads</w:t>
         <w:br/>
-        <w:t>• English common law certainty for tokenisation</w:t>
+        <w:t>• English common law certainty for tokenisation [KB-014]</w:t>
         <w:br/>
-        <w:t>• Early FSRA licensing track record</w:t>
+        <w:t>• Early FSRA licensing track record [KB-014]</w:t>
         <w:br/>
         <w:br/>
         <w:t>Where MAS leads</w:t>
         <w:br/>
-        <w:t>• Retail-access experimentation; stablecoin framework depth</w:t>
+        <w:t>• Retail-access experimentation; stablecoin framework depth [KB-018]</w:t>
         <w:br/>
         <w:br/>
-        <w:t>Benchmark (Strategy AI)</w:t>
+        <w:t>Benchmark — curated benchmark doc, as of May 2026 [KB-022]</w:t>
         <w:br/>
         <w:t>• Digital-assets framework — ADGM 88 / MAS 90</w:t>
         <w:br/>
-        <w:t>• Regulatory agility — ADGM 86 / MAS 88</w:t>
+        <w:t>• Regulatory agility       — ADGM 86 / MAS 88</w:t>
         <w:br/>
         <w:br/>
-        <w:t>Recommended action (Policy)</w:t>
+        <w:t>Analysis (Policy AI) — recommendation, not a sourced fact</w:t>
         <w:br/>
-        <w:t>• Accelerate FSRA digital-fund guidance; foreground legal-certainty advantage</w:t>
+        <w:t>• Accelerate FSRA digital-fund guidance; foreground the legal-certainty advantage</w:t>
+        <w:br/>
+        <w:br/>
+        <w:t>Sources: KB-014 (ADGM digital-assets overview), KB-018 (MAS framework note),</w:t>
+        <w:br/>
+        <w:t xml:space="preserve">         KB-022 (ADGM–MAS benchmark, May 2026)        Grounding: full</w:t>
+      </w:r>
+    </w:p>
+    <w:p>
+      <w:r>
+        <w:t>The benchmark scores are tied to a dated source handle, not asserted free-floating; the recommendation is marked as analysis.</w:t>
       </w:r>
     </w:p>
     <w:p>
@@ -2874,7 +3700,7 @@
         <w:pStyle w:val="Heading2"/>
       </w:pPr>
       <w:r>
-        <w:t>7.2 CoS + Relationship — Pre-meeting brief</w:t>
+        <w:t>8.2 CoS + Relationship — Pre-meeting brief</w:t>
       </w:r>
     </w:p>
     <w:p>
@@ -2888,18 +3714,28 @@
           <w:color w:val="333333"/>
           <w:sz w:val="18"/>
         </w:rPr>
-        <w:t>## Pre-meeting brief — [Meeting title]</w:t>
+        <w:t>## Pre-meeting brief — [Meeting title] [CAL-1500]</w:t>
         <w:br/>
         <w:br/>
-        <w:t>Who — attendees, relationship warmth, last engagement</w:t>
+        <w:t>Who — attendees, relationship warmth, last engagement [CRM-emaar]</w:t>
         <w:br/>
-        <w:t>Their agenda — expected topics</w:t>
+        <w:t>Their agenda — expected topics (inferred where no source) [CRM-emaar]</w:t>
         <w:br/>
-        <w:t>Your talking points — 3 bullets</w:t>
+        <w:t>Talking points — 3 bullets — Analysis (Comms / Strategy)</w:t>
         <w:br/>
-        <w:t>Watch-outs — sensitivities</w:t>
+        <w:t>Watch-outs — sensitivities [CRM-emaar]</w:t>
         <w:br/>
-        <w:t>Suggested ask — one concrete ask before Q3</w:t>
+        <w:t>Suggested ask — one concrete ask before Q3 — Analysis</w:t>
+        <w:br/>
+        <w:t>Open actions — [ACT-07], [ACT-11]</w:t>
+        <w:br/>
+        <w:br/>
+        <w:t>Sources: CAL-1500, CRM-emaar, ACT-07, ACT-11          Grounding: partial</w:t>
+      </w:r>
+    </w:p>
+    <w:p>
+      <w:r>
+        <w:t>`Grounding: partial` because the agenda and the ask are interpretation, not records.</w:t>
       </w:r>
     </w:p>
     <w:p>
@@ -2907,7 +3743,7 @@
         <w:pStyle w:val="Heading2"/>
       </w:pPr>
       <w:r>
-        <w:t>7.3 Communications — Ministerial note</w:t>
+        <w:t>8.3 Communications — Ministerial note</w:t>
       </w:r>
     </w:p>
     <w:p>
@@ -2926,7 +3762,7 @@
         <w:br/>
         <w:t>العربية</w:t>
         <w:br/>
-        <w:t>[Formal paragraph to HH office]</w:t>
+        <w:t>[Formal paragraph to the HH office]</w:t>
         <w:br/>
         <w:br/>
         <w:t>English</w:t>
@@ -2934,7 +3770,15 @@
         <w:t>[Matching formal paragraph]</w:t>
         <w:br/>
         <w:br/>
-        <w:t>[Optional: metrics from Strategy/CoS — departments green, D33 score]</w:t>
+        <w:t>Metrics — departments green [KB-031]; D33 score [MKT-2026-06-03]</w:t>
+        <w:br/>
+        <w:br/>
+        <w:t>Sources: KB-031, MKT-2026-06-03    Grounding: full    Verification pass: passed</w:t>
+      </w:r>
+    </w:p>
+    <w:p>
+      <w:r>
+        <w:t>Ministerial output always runs the verification pass (§6.5) before it ships.</w:t>
       </w:r>
     </w:p>
     <w:p/>
@@ -2943,7 +3787,7 @@
         <w:pStyle w:val="Heading1"/>
       </w:pPr>
       <w:r>
-        <w:t>8. Prototype vs production (stakeholder clarity)</w:t>
+        <w:t>9. Prototype vs production (stakeholder clarity)</w:t>
       </w:r>
     </w:p>
     <w:tbl>
@@ -3050,7 +3894,7 @@
           </w:tcPr>
           <w:p>
             <w:r>
-              <w:t>Keyword + focus-area rules</w:t>
+              <w:t>Keyword + focus-area rules (selects blocks + data slices)</w:t>
             </w:r>
           </w:p>
         </w:tc>
@@ -3136,6 +3980,102 @@
           </w:tcPr>
           <w:p>
             <w:r>
+              <w:t>**Source integrity**</w:t>
+            </w:r>
+          </w:p>
+        </w:tc>
+        <w:tc>
+          <w:tcPr>
+            <w:tcW w:type="dxa" w:w="3120"/>
+          </w:tcPr>
+          <w:p>
+            <w:r>
+              <w:t>Handle citation + post-validation against the seeded store</w:t>
+            </w:r>
+          </w:p>
+        </w:tc>
+        <w:tc>
+          <w:tcPr>
+            <w:tcW w:type="dxa" w:w="3120"/>
+          </w:tcPr>
+          <w:p>
+            <w:r>
+              <w:t>Same contract over live sources, with an audit log of every cited handle</w:t>
+            </w:r>
+          </w:p>
+        </w:tc>
+      </w:tr>
+      <w:tr>
+        <w:tc>
+          <w:tcPr>
+            <w:tcW w:type="dxa" w:w="3120"/>
+          </w:tcPr>
+          <w:p>
+            <w:r>
+              <w:t>**Hallucination guardrail**</w:t>
+            </w:r>
+          </w:p>
+        </w:tc>
+        <w:tc>
+          <w:tcPr>
+            <w:tcW w:type="dxa" w:w="3120"/>
+          </w:tcPr>
+          <w:p>
+            <w:r>
+              <w:t>Closed-book rule + snippet match + verification pass on high-stakes output</w:t>
+            </w:r>
+          </w:p>
+        </w:tc>
+        <w:tc>
+          <w:tcPr>
+            <w:tcW w:type="dxa" w:w="3120"/>
+          </w:tcPr>
+          <w:p>
+            <w:r>
+              <w:t>Full verification pass on every answer + human approval gate on ministerial output</w:t>
+            </w:r>
+          </w:p>
+        </w:tc>
+      </w:tr>
+      <w:tr>
+        <w:tc>
+          <w:tcPr>
+            <w:tcW w:type="dxa" w:w="3120"/>
+          </w:tcPr>
+          <w:p>
+            <w:r>
+              <w:t>**Confidence signal**</w:t>
+            </w:r>
+          </w:p>
+        </w:tc>
+        <w:tc>
+          <w:tcPr>
+            <w:tcW w:type="dxa" w:w="3120"/>
+          </w:tcPr>
+          <w:p>
+            <w:r>
+              <w:t>Coverage-derived grounding indicator (full/partial/inferred)</w:t>
+            </w:r>
+          </w:p>
+        </w:tc>
+        <w:tc>
+          <w:tcPr>
+            <w:tcW w:type="dxa" w:w="3120"/>
+          </w:tcPr>
+          <w:p>
+            <w:r>
+              <w:t>Same, plus per-claim provenance trail</w:t>
+            </w:r>
+          </w:p>
+        </w:tc>
+      </w:tr>
+      <w:tr>
+        <w:tc>
+          <w:tcPr>
+            <w:tcW w:type="dxa" w:w="3120"/>
+          </w:tcPr>
+          <w:p>
+            <w:r>
               <w:t>Arabic</w:t>
             </w:r>
           </w:p>
@@ -3200,7 +4140,7 @@
         <w:pStyle w:val="Heading1"/>
       </w:pPr>
       <w:r>
-        <w:t>9. Glossary</w:t>
+        <w:t>10. Glossary</w:t>
       </w:r>
     </w:p>
     <w:tbl>
@@ -3370,7 +4310,7 @@
           </w:tcPr>
           <w:p>
             <w:r>
-              <w:t>Automatic agent selection from question topic</w:t>
+              <w:t>Automatic agent selection from question topic, driving block and data-slice assembly</w:t>
             </w:r>
           </w:p>
         </w:tc>
@@ -3397,6 +4337,116 @@
           </w:p>
         </w:tc>
       </w:tr>
+      <w:tr>
+        <w:tc>
+          <w:tcPr>
+            <w:tcW w:type="dxa" w:w="4680"/>
+          </w:tcPr>
+          <w:p>
+            <w:r>
+              <w:t>**Source handle**</w:t>
+            </w:r>
+          </w:p>
+        </w:tc>
+        <w:tc>
+          <w:tcPr>
+            <w:tcW w:type="dxa" w:w="4680"/>
+          </w:tcPr>
+          <w:p>
+            <w:r>
+              <w:t>Stable ID for an injected record (`KB-`/`ACT-`/`CAL-`/`CRM-`/`MKT-`); the only thing the model may cite</w:t>
+            </w:r>
+          </w:p>
+        </w:tc>
+      </w:tr>
+      <w:tr>
+        <w:tc>
+          <w:tcPr>
+            <w:tcW w:type="dxa" w:w="4680"/>
+          </w:tcPr>
+          <w:p>
+            <w:r>
+              <w:t>**Grounding indicator**</w:t>
+            </w:r>
+          </w:p>
+        </w:tc>
+        <w:tc>
+          <w:tcPr>
+            <w:tcW w:type="dxa" w:w="4680"/>
+          </w:tcPr>
+          <w:p>
+            <w:r>
+              <w:t>`full` / `partial` / `inferred` — coverage-based signal that replaces a confidence percentage</w:t>
+            </w:r>
+          </w:p>
+        </w:tc>
+      </w:tr>
+      <w:tr>
+        <w:tc>
+          <w:tcPr>
+            <w:tcW w:type="dxa" w:w="4680"/>
+          </w:tcPr>
+          <w:p>
+            <w:r>
+              <w:t>**Closed-book / open-book**</w:t>
+            </w:r>
+          </w:p>
+        </w:tc>
+        <w:tc>
+          <w:tcPr>
+            <w:tcW w:type="dxa" w:w="4680"/>
+          </w:tcPr>
+          <w:p>
+            <w:r>
+              <w:t>Facts come only from injected context (closed-book); interpretation is permitted but labelled as analysis (open-book)</w:t>
+            </w:r>
+          </w:p>
+        </w:tc>
+      </w:tr>
+      <w:tr>
+        <w:tc>
+          <w:tcPr>
+            <w:tcW w:type="dxa" w:w="4680"/>
+          </w:tcPr>
+          <w:p>
+            <w:r>
+              <w:t>**Abstention**</w:t>
+            </w:r>
+          </w:p>
+        </w:tc>
+        <w:tc>
+          <w:tcPr>
+            <w:tcW w:type="dxa" w:w="4680"/>
+          </w:tcPr>
+          <w:p>
+            <w:r>
+              <w:t>Returning "no source available" instead of inventing; counted as a correct outcome in eval</w:t>
+            </w:r>
+          </w:p>
+        </w:tc>
+      </w:tr>
+      <w:tr>
+        <w:tc>
+          <w:tcPr>
+            <w:tcW w:type="dxa" w:w="4680"/>
+          </w:tcPr>
+          <w:p>
+            <w:r>
+              <w:t>**Verification pass**</w:t>
+            </w:r>
+          </w:p>
+        </w:tc>
+        <w:tc>
+          <w:tcPr>
+            <w:tcW w:type="dxa" w:w="4680"/>
+          </w:tcPr>
+          <w:p>
+            <w:r>
+              <w:t>A second model pass that checks each factual claim against the injected sources before a high-stakes answer ships</w:t>
+            </w:r>
+          </w:p>
+        </w:tc>
+      </w:tr>
     </w:tbl>
     <w:p/>
     <w:p>
@@ -3404,7 +4454,7 @@
         <w:pStyle w:val="Heading1"/>
       </w:pPr>
       <w:r>
-        <w:t>10. Document conversion notes</w:t>
+        <w:t>11. Document conversion notes</w:t>
       </w:r>
     </w:p>
     <w:p>
@@ -3433,7 +4483,7 @@
         <w:pStyle w:val="ListBullet"/>
       </w:pPr>
       <w:r>
-        <w:t>**PowerPoint:** Use Section 3 (one slide per agent), Section 5 (format slides), Section 6 (briefing table slide).</w:t>
+        <w:t>**PowerPoint:** Use Section 3 (one slide per agent), Section 5 (format slides), Section 6 (the grounding contract as a trust slide), Section 7 (briefing table slide).</w:t>
       </w:r>
     </w:p>
     <w:p>

</xml_diff>

<commit_message>
Add senior McKinsey strategy manager persona to prompts and docs.
Stakeholders can open questions with this framing; live Claude system prompt adopts MECE, recommendation-first tone while keeping ADGM grounding.

Co-authored-by: Cursor <cursoragent@cursor.com>
</commit_message>
<xml_diff>
--- a/docs/ADGM-Agent-Behaviours-and-Answer-Formats.docx
+++ b/docs/ADGM-Agent-Behaviours-and-Answer-Formats.docx
@@ -2129,6 +2129,28 @@
           </w:tcPr>
           <w:p>
             <w:r>
+              <w:t>**Persona framing**</w:t>
+            </w:r>
+          </w:p>
+        </w:tc>
+        <w:tc>
+          <w:tcPr>
+            <w:tcW w:type="dxa" w:w="4680"/>
+          </w:tcPr>
+          <w:p>
+            <w:r>
+              <w:t>At the start of a turn, the user may also say: *"You are a senior McKinsey strategy manager."* That line sets consulting-grade structure (hypothesis-led, MECE, recommendation-first) for that answer. The default system prompt already includes this persona; saying it in the question reinforces tone without replacing ADGM grounding (§6).</w:t>
+            </w:r>
+          </w:p>
+        </w:tc>
+      </w:tr>
+      <w:tr>
+        <w:tc>
+          <w:tcPr>
+            <w:tcW w:type="dxa" w:w="4680"/>
+          </w:tcPr>
+          <w:p>
+            <w:r>
               <w:t>**Grounding**</w:t>
             </w:r>
           </w:p>
@@ -2197,6 +2219,34 @@
     <w:p>
       <w:r>
         <w:t>**Demo mode:** Same topics use scripted templates matching the structures below; demo records carry the same handles so citations resolve.</w:t>
+      </w:r>
+    </w:p>
+    <w:p>
+      <w:r>
+        <w:rPr>
+          <w:i/>
+        </w:rPr>
+        <w:t>**Optional opening line (user or prompt)**</w:t>
+      </w:r>
+    </w:p>
+    <w:p>
+      <w:r>
+        <w:t>You could also say at the beginning of the question:</w:t>
+      </w:r>
+    </w:p>
+    <w:p>
+      <w:r>
+        <w:t>&gt; You are a senior McKinsey strategy manager.</w:t>
+      </w:r>
+    </w:p>
+    <w:p>
+      <w:r>
+        <w:t>Use this when you want sharper strategic framing—situation → insight → recommendation—while still requiring cited facts from injected ADGM data (§6). Example:</w:t>
+      </w:r>
+    </w:p>
+    <w:p>
+      <w:r>
+        <w:t>&gt; You are a senior McKinsey strategy manager. Compare ADGM digital-assets positioning vs MAS and give me one decision for the CSO this week.</w:t>
       </w:r>
     </w:p>
     <w:p/>

</xml_diff>